<commit_message>
Keep heading styles and cell emphasis in DOCX and ODT.
</commit_message>
<xml_diff>
--- a/docs/assets/letter.docx
+++ b/docs/assets/letter.docx
@@ -3,17 +3,29 @@
 <w:document xmlns:w="http://schemas.openxmlformats.org/wordprocessingml/2006/main">
   <w:body>
     <w:p>
+      <w:pPr>
+        <w:pStyle w:val="Heading1"/>
+        <w:outlineLvl w:val="0"/>
+      </w:pPr>
       <w:r>
         <w:rPr>
           <w:b/>
+          <w:sz w:val="36"/>
+          <w:szCs w:val="36"/>
         </w:rPr>
         <w:t xml:space="preserve">Northwind Freight</w:t>
       </w:r>
     </w:p>
     <w:p>
+      <w:pPr>
+        <w:pStyle w:val="Heading2"/>
+        <w:outlineLvl w:val="1"/>
+      </w:pPr>
       <w:r>
         <w:rPr>
           <w:b/>
+          <w:sz w:val="28"/>
+          <w:szCs w:val="28"/>
         </w:rPr>
         <w:t xml:space="preserve">Delivery confirmation — order 48291</w:t>
       </w:r>
@@ -253,4 +265,54 @@
     </w:sectPr>
   </w:body>
 </w:document>
+</file>
+
+<file path=word/styles.xml><?xml version="1.0" encoding="utf-8"?>
+<w:styles xmlns:w="http://schemas.openxmlformats.org/wordprocessingml/2006/main">
+  <w:style w:type="paragraph" w:default="1" w:styleId="Normal">
+    <w:name w:val="Normal"/>
+  </w:style>
+  <w:style w:type="paragraph" w:styleId="Heading1">
+    <w:name w:val="heading 1"/>
+    <w:basedOn w:val="Normal"/>
+    <w:uiPriority w:val="9"/>
+    <w:qFormat/>
+    <w:pPr>
+      <w:outlineLvl w:val="0"/>
+    </w:pPr>
+    <w:rPr>
+      <w:b/>
+      <w:sz w:val="36"/>
+      <w:szCs w:val="36"/>
+    </w:rPr>
+  </w:style>
+  <w:style w:type="paragraph" w:styleId="Heading2">
+    <w:name w:val="heading 2"/>
+    <w:basedOn w:val="Normal"/>
+    <w:uiPriority w:val="9"/>
+    <w:qFormat/>
+    <w:pPr>
+      <w:outlineLvl w:val="1"/>
+    </w:pPr>
+    <w:rPr>
+      <w:b/>
+      <w:sz w:val="28"/>
+      <w:szCs w:val="28"/>
+    </w:rPr>
+  </w:style>
+  <w:style w:type="paragraph" w:styleId="Heading3">
+    <w:name w:val="heading 3"/>
+    <w:basedOn w:val="Normal"/>
+    <w:uiPriority w:val="9"/>
+    <w:qFormat/>
+    <w:pPr>
+      <w:outlineLvl w:val="2"/>
+    </w:pPr>
+    <w:rPr>
+      <w:b/>
+      <w:sz w:val="24"/>
+      <w:szCs w:val="24"/>
+    </w:rPr>
+  </w:style>
+</w:styles>
 </file>
</xml_diff>

<commit_message>
Keep table-cell emphasis in HTML and markdown.
</commit_message>
<xml_diff>
--- a/docs/assets/letter.docx
+++ b/docs/assets/letter.docx
@@ -77,6 +77,9 @@
           </w:tcPr>
           <w:p>
             <w:r>
+              <w:rPr>
+                <w:b/>
+              </w:rPr>
               <w:t xml:space="preserve">Hop</w:t>
             </w:r>
           </w:p>
@@ -87,6 +90,9 @@
           </w:tcPr>
           <w:p>
             <w:r>
+              <w:rPr>
+                <w:b/>
+              </w:rPr>
               <w:t xml:space="preserve">File</w:t>
             </w:r>
           </w:p>
@@ -97,6 +103,9 @@
           </w:tcPr>
           <w:p>
             <w:r>
+              <w:rPr>
+                <w:b/>
+              </w:rPr>
               <w:t xml:space="preserve">Proof</w:t>
             </w:r>
           </w:p>

</xml_diff>

<commit_message>
Keep lists in DOCX numbering and markdown spacing.
</commit_message>
<xml_diff>
--- a/docs/assets/letter.docx
+++ b/docs/assets/letter.docx
@@ -214,21 +214,45 @@
       </w:r>
     </w:p>
     <w:p>
+      <w:pPr>
+        <w:numPr>
+          <w:ilvl w:val="0"/>
+          <w:numId w:val="1"/>
+        </w:numPr>
+      </w:pPr>
       <w:r>
         <w:t xml:space="preserve">Receiving dock is clear</w:t>
       </w:r>
     </w:p>
     <w:p>
+      <w:pPr>
+        <w:numPr>
+          <w:ilvl w:val="1"/>
+          <w:numId w:val="1"/>
+        </w:numPr>
+      </w:pPr>
       <w:r>
         <w:t xml:space="preserve">Bay 4, not bay 2</w:t>
       </w:r>
     </w:p>
     <w:p>
+      <w:pPr>
+        <w:numPr>
+          <w:ilvl w:val="0"/>
+          <w:numId w:val="1"/>
+        </w:numPr>
+      </w:pPr>
       <w:r>
         <w:t xml:space="preserve">Capsule hashes travel with the files</w:t>
       </w:r>
     </w:p>
     <w:p>
+      <w:pPr>
+        <w:numPr>
+          <w:ilvl w:val="0"/>
+          <w:numId w:val="1"/>
+        </w:numPr>
+      </w:pPr>
       <w:r>
         <w:t xml:space="preserve">Replay the convert instead of hoping</w:t>
       </w:r>
@@ -239,26 +263,56 @@
       </w:r>
     </w:p>
     <w:p>
+      <w:pPr>
+        <w:numPr>
+          <w:ilvl w:val="0"/>
+          <w:numId w:val="2"/>
+        </w:numPr>
+      </w:pPr>
       <w:r>
         <w:t xml:space="preserve">Hash the input</w:t>
       </w:r>
     </w:p>
     <w:p>
+      <w:pPr>
+        <w:numPr>
+          <w:ilvl w:val="0"/>
+          <w:numId w:val="2"/>
+        </w:numPr>
+      </w:pPr>
       <w:r>
         <w:t xml:space="preserve">Run Convert</w:t>
       </w:r>
     </w:p>
     <w:p>
+      <w:pPr>
+        <w:numPr>
+          <w:ilvl w:val="1"/>
+          <w:numId w:val="1"/>
+        </w:numPr>
+      </w:pPr>
       <w:r>
         <w:t xml:space="preserve">PDF/A</w:t>
       </w:r>
     </w:p>
     <w:p>
+      <w:pPr>
+        <w:numPr>
+          <w:ilvl w:val="1"/>
+          <w:numId w:val="1"/>
+        </w:numPr>
+      </w:pPr>
       <w:r>
         <w:t xml:space="preserve">HTML</w:t>
       </w:r>
     </w:p>
     <w:p>
+      <w:pPr>
+        <w:numPr>
+          <w:ilvl w:val="0"/>
+          <w:numId w:val="2"/>
+        </w:numPr>
+      </w:pPr>
       <w:r>
         <w:t xml:space="preserve">Compare the capsule</w:t>
       </w:r>
@@ -274,6 +328,77 @@
     </w:sectPr>
   </w:body>
 </w:document>
+</file>
+
+<file path=word/numbering.xml><?xml version="1.0" encoding="utf-8"?>
+<w:numbering xmlns:w="http://schemas.openxmlformats.org/wordprocessingml/2006/main">
+  <w:abstractNum w:abstractNumId="0">
+    <w:multiLevelType w:val="hybridMultilevel"/>
+    <w:lvl w:ilvl="0">
+      <w:start w:val="1"/>
+      <w:numFmt w:val="bullet"/>
+      <w:lvlText w:val="•"/>
+      <w:lvlJc w:val="left"/>
+      <w:pPr>
+        <w:ind w:left="720" w:hanging="360"/>
+      </w:pPr>
+    </w:lvl>
+    <w:lvl w:ilvl="1">
+      <w:start w:val="1"/>
+      <w:numFmt w:val="bullet"/>
+      <w:lvlText w:val="•"/>
+      <w:lvlJc w:val="left"/>
+      <w:pPr>
+        <w:ind w:left="1440" w:hanging="360"/>
+      </w:pPr>
+    </w:lvl>
+    <w:lvl w:ilvl="2">
+      <w:start w:val="1"/>
+      <w:numFmt w:val="bullet"/>
+      <w:lvlText w:val="•"/>
+      <w:lvlJc w:val="left"/>
+      <w:pPr>
+        <w:ind w:left="2160" w:hanging="360"/>
+      </w:pPr>
+    </w:lvl>
+  </w:abstractNum>
+  <w:abstractNum w:abstractNumId="1">
+    <w:multiLevelType w:val="hybridMultilevel"/>
+    <w:lvl w:ilvl="0">
+      <w:start w:val="1"/>
+      <w:numFmt w:val="decimal"/>
+      <w:lvlText w:val="%1."/>
+      <w:lvlJc w:val="left"/>
+      <w:pPr>
+        <w:ind w:left="720" w:hanging="360"/>
+      </w:pPr>
+    </w:lvl>
+    <w:lvl w:ilvl="1">
+      <w:start w:val="1"/>
+      <w:numFmt w:val="decimal"/>
+      <w:lvlText w:val="%2."/>
+      <w:lvlJc w:val="left"/>
+      <w:pPr>
+        <w:ind w:left="1440" w:hanging="360"/>
+      </w:pPr>
+    </w:lvl>
+    <w:lvl w:ilvl="2">
+      <w:start w:val="1"/>
+      <w:numFmt w:val="decimal"/>
+      <w:lvlText w:val="%3."/>
+      <w:lvlJc w:val="left"/>
+      <w:pPr>
+        <w:ind w:left="2160" w:hanging="360"/>
+      </w:pPr>
+    </w:lvl>
+  </w:abstractNum>
+  <w:num w:numId="1">
+    <w:abstractNumId w:val="0"/>
+  </w:num>
+  <w:num w:numId="2">
+    <w:abstractNumId w:val="1"/>
+  </w:num>
+</w:numbering>
 </file>
 
 <file path=word/styles.xml><?xml version="1.0" encoding="utf-8"?>

</xml_diff>

<commit_message>
Keep hyperlinks as IR runs with underline fills.
</commit_message>
<xml_diff>
--- a/docs/assets/letter.docx
+++ b/docs/assets/letter.docx
@@ -1,6 +1,6 @@
 
 <file path=word/document.xml><?xml version="1.0" encoding="utf-8"?>
-<w:document xmlns:w="http://schemas.openxmlformats.org/wordprocessingml/2006/main">
+<w:document xmlns:w="http://schemas.openxmlformats.org/wordprocessingml/2006/main" xmlns:r="http://schemas.openxmlformats.org/officeDocument/2006/relationships">
   <w:body>
     <w:p>
       <w:pPr>
@@ -318,8 +318,16 @@
       </w:r>
     </w:p>
     <w:p>
-      <w:r>
-        <w:t xml:space="preserve">DocAgent runtime — DOCX · ODT · Markdown · HTML · PDF/A</w:t>
+      <w:hyperlink r:id="rId3">
+        <w:r>
+          <w:rPr>
+            <w:u w:val="single"/>
+          </w:rPr>
+          <w:t xml:space="preserve">DocAgent</w:t>
+        </w:r>
+      </w:hyperlink>
+      <w:r>
+        <w:t xml:space="preserve"> runtime — DOCX · ODT · Markdown · HTML · PDF/A</w:t>
       </w:r>
     </w:p>
     <w:sectPr>

</xml_diff>

<commit_message>
Keep strikethrough as mid-line PDF fills.
</commit_message>
<xml_diff>
--- a/docs/assets/letter.docx
+++ b/docs/assets/letter.docx
@@ -58,6 +58,15 @@
           <w:i/>
         </w:rPr>
         <w:t xml:space="preserve">byte-for-byte</w:t>
+      </w:r>
+      <w:r>
+        <w:t xml:space="preserve">. Agents </w:t>
+      </w:r>
+      <w:r>
+        <w:rPr>
+          <w:strike/>
+        </w:rPr>
+        <w:t xml:space="preserve">guess</w:t>
       </w:r>
       <w:r>
         <w:t xml:space="preserve">.</w:t>

</xml_diff>

<commit_message>
Keep block quotes as left-bar PDF fills.
</commit_message>
<xml_diff>
--- a/docs/assets/letter.docx
+++ b/docs/assets/letter.docx
@@ -70,6 +70,17 @@
       </w:r>
       <w:r>
         <w:t xml:space="preserve">.</w:t>
+      </w:r>
+    </w:p>
+    <w:p>
+      <w:pPr>
+        <w:pStyle w:val="Quote"/>
+        <w:pBdr>
+          <w:left w:val="single" w:sz="24" w:space="4" w:color="134E4A"/>
+        </w:pBdr>
+      </w:pPr>
+      <w:r>
+        <w:t xml:space="preserve">Replay is evidence. Same fonts, same bytes.</w:t>
       </w:r>
     </w:p>
     <w:tbl>
@@ -465,5 +476,16 @@
       <w:szCs w:val="24"/>
     </w:rPr>
   </w:style>
+  <w:style w:type="paragraph" w:styleId="Quote">
+    <w:name w:val="Quote"/>
+    <w:basedOn w:val="Normal"/>
+    <w:qFormat/>
+    <w:pPr>
+      <w:pBdr>
+        <w:left w:val="single" w:sz="24" w:space="4" w:color="134E4A"/>
+      </w:pBdr>
+      <w:ind w:left="144"/>
+    </w:pPr>
+  </w:style>
 </w:styles>
 </file>
</xml_diff>

<commit_message>
Keep code spans as teal background fills.
</commit_message>
<xml_diff>
--- a/docs/assets/letter.docx
+++ b/docs/assets/letter.docx
@@ -51,7 +51,17 @@
         <w:t xml:space="preserve">GPU-free</w:t>
       </w:r>
       <w:r>
-        <w:t xml:space="preserve">. Run it twice with the same fonts and the PDF/A bytes match </w:t>
+        <w:t xml:space="preserve">. Run </w:t>
+      </w:r>
+      <w:r>
+        <w:rPr>
+          <w:rStyle w:val="Code"/>
+          <w:shd w:val="clear" w:fill="CCFBF1"/>
+        </w:rPr>
+        <w:t xml:space="preserve">prove</w:t>
+      </w:r>
+      <w:r>
+        <w:t xml:space="preserve"> twice with the same fonts and the PDF/A bytes match </w:t>
       </w:r>
       <w:r>
         <w:rPr>
@@ -487,5 +497,12 @@
       <w:ind w:left="144"/>
     </w:pPr>
   </w:style>
+  <w:style w:type="character" w:styleId="Code">
+    <w:name w:val="Code"/>
+    <w:rPr>
+      <w:rFonts w:ascii="Consolas" w:hAnsi="Consolas"/>
+      <w:shd w:val="clear" w:fill="CCFBF1"/>
+    </w:rPr>
+  </w:style>
 </w:styles>
 </file>
</xml_diff>

<commit_message>
Keep thematic breaks as full-width PDF fills.
</commit_message>
<xml_diff>
--- a/docs/assets/letter.docx
+++ b/docs/assets/letter.docx
@@ -238,6 +238,14 @@
         </w:tc>
       </w:tr>
     </w:tbl>
+    <w:p>
+      <w:pPr>
+        <w:pStyle w:val="HorizontalLine"/>
+        <w:pBdr>
+          <w:bottom w:val="single" w:sz="12" w:space="1" w:color="134E4A"/>
+        </w:pBdr>
+      </w:pPr>
+    </w:p>
     <w:p>
       <w:r>
         <w:t xml:space="preserve">Please confirm before 09:00 local:</w:t>
@@ -504,5 +512,14 @@
       <w:shd w:val="clear" w:fill="CCFBF1"/>
     </w:rPr>
   </w:style>
+  <w:style w:type="paragraph" w:styleId="HorizontalLine">
+    <w:name w:val="Horizontal Line"/>
+    <w:basedOn w:val="Normal"/>
+    <w:pPr>
+      <w:pBdr>
+        <w:bottom w:val="single" w:sz="12" w:space="1" w:color="134E4A"/>
+      </w:pBdr>
+    </w:pPr>
+  </w:style>
 </w:styles>
 </file>
</xml_diff>

<commit_message>
Keep fenced code blocks as teal background fills.
</commit_message>
<xml_diff>
--- a/docs/assets/letter.docx
+++ b/docs/assets/letter.docx
@@ -91,6 +91,15 @@
       </w:pPr>
       <w:r>
         <w:t xml:space="preserve">Replay is evidence. Same fonts, same bytes.</w:t>
+      </w:r>
+    </w:p>
+    <w:p>
+      <w:pPr>
+        <w:pStyle w:val="CodeBlock"/>
+        <w:shd w:val="clear" w:fill="CCFBF1"/>
+      </w:pPr>
+      <w:r>
+        <w:t xml:space="preserve">docagent prove examples/letter.md</w:t>
       </w:r>
     </w:p>
     <w:tbl>
@@ -521,5 +530,15 @@
       </w:pBdr>
     </w:pPr>
   </w:style>
+  <w:style w:type="paragraph" w:styleId="CodeBlock">
+    <w:name w:val="Code Block"/>
+    <w:basedOn w:val="Normal"/>
+    <w:pPr>
+      <w:shd w:val="clear" w:fill="CCFBF1"/>
+    </w:pPr>
+    <w:rPr>
+      <w:rFonts w:ascii="Consolas" w:hAnsi="Consolas"/>
+    </w:rPr>
+  </w:style>
 </w:styles>
 </file>
</xml_diff>

<commit_message>
Keep GFM task lists as checkbox fills.
</commit_message>
<xml_diff>
--- a/docs/assets/letter.docx
+++ b/docs/assets/letter.docx
@@ -268,7 +268,7 @@
         </w:numPr>
       </w:pPr>
       <w:r>
-        <w:t xml:space="preserve">Receiving dock is clear</w:t>
+        <w:t xml:space="preserve">[x] Receiving dock is clear</w:t>
       </w:r>
     </w:p>
     <w:p>
@@ -290,7 +290,7 @@
         </w:numPr>
       </w:pPr>
       <w:r>
-        <w:t xml:space="preserve">Capsule hashes travel with the files</w:t>
+        <w:t xml:space="preserve">[x] Capsule hashes travel with the files</w:t>
       </w:r>
     </w:p>
     <w:p>
@@ -301,7 +301,7 @@
         </w:numPr>
       </w:pPr>
       <w:r>
-        <w:t xml:space="preserve">Replay the convert instead of hoping</w:t>
+        <w:t xml:space="preserve">[ ] Replay the convert instead of hoping</w:t>
       </w:r>
     </w:p>
     <w:p>

</xml_diff>

<commit_message>
Keep highlight marks as amber PDF fills.
</commit_message>
<xml_diff>
--- a/docs/assets/letter.docx
+++ b/docs/assets/letter.docx
@@ -42,7 +42,16 @@
     </w:p>
     <w:p>
       <w:r>
-        <w:t xml:space="preserve">The shipment left Busan on 4 September and is booked on the 11 September rail window. This is a flow document: one convert, three hashes, </w:t>
+        <w:t xml:space="preserve">The shipment left Busan on 4 September and is booked on the 11 September rail window. This is a flow document: one convert, </w:t>
+      </w:r>
+      <w:r>
+        <w:rPr>
+          <w:highlight w:val="yellow"/>
+        </w:rPr>
+        <w:t xml:space="preserve">three hashes</w:t>
+      </w:r>
+      <w:r>
+        <w:t xml:space="preserve">, </w:t>
       </w:r>
       <w:r>
         <w:rPr>

</xml_diff>

<commit_message>
Keep plain underlines as teal PDF fills.
</commit_message>
<xml_diff>
--- a/docs/assets/letter.docx
+++ b/docs/assets/letter.docx
@@ -266,7 +266,16 @@
     </w:p>
     <w:p>
       <w:r>
-        <w:t xml:space="preserve">Please confirm before 09:00 local:</w:t>
+        <w:t xml:space="preserve">Please confirm before </w:t>
+      </w:r>
+      <w:r>
+        <w:rPr>
+          <w:u w:val="single"/>
+        </w:rPr>
+        <w:t xml:space="preserve">09:00 local</w:t>
+      </w:r>
+      <w:r>
+        <w:t xml:space="preserve">:</w:t>
       </w:r>
     </w:p>
     <w:p>

</xml_diff>

<commit_message>
Keep superscripts as a smaller raised face.
</commit_message>
<xml_diff>
--- a/docs/assets/letter.docx
+++ b/docs/assets/letter.docx
@@ -70,7 +70,16 @@
         <w:t xml:space="preserve">prove</w:t>
       </w:r>
       <w:r>
-        <w:t xml:space="preserve"> twice with the same fonts and the PDF/A bytes match </w:t>
+        <w:t xml:space="preserve"> twice with the same fonts and the PDF/</w:t>
+      </w:r>
+      <w:r>
+        <w:rPr>
+          <w:vertAlign w:val="superscript"/>
+        </w:rPr>
+        <w:t xml:space="preserve">A</w:t>
+      </w:r>
+      <w:r>
+        <w:t xml:space="preserve"> bytes match </w:t>
       </w:r>
       <w:r>
         <w:rPr>
@@ -240,7 +249,16 @@
           </w:tcPr>
           <w:p>
             <w:r>
-              <w:t xml:space="preserve">PDF/A · HTML · ODT</w:t>
+              <w:t xml:space="preserve">PDF/</w:t>
+            </w:r>
+            <w:r>
+              <w:rPr>
+                <w:vertAlign w:val="superscript"/>
+              </w:rPr>
+              <w:t xml:space="preserve">A</w:t>
+            </w:r>
+            <w:r>
+              <w:t xml:space="preserve"> · HTML · ODT</w:t>
             </w:r>
           </w:p>
         </w:tc>
@@ -357,7 +375,13 @@
         </w:numPr>
       </w:pPr>
       <w:r>
-        <w:t xml:space="preserve">PDF/A</w:t>
+        <w:t xml:space="preserve">PDF/</w:t>
+      </w:r>
+      <w:r>
+        <w:rPr>
+          <w:vertAlign w:val="superscript"/>
+        </w:rPr>
+        <w:t xml:space="preserve">A</w:t>
       </w:r>
     </w:p>
     <w:p>
@@ -392,7 +416,13 @@
         </w:r>
       </w:hyperlink>
       <w:r>
-        <w:t xml:space="preserve"> runtime — DOCX · ODT · Markdown · HTML · PDF/A</w:t>
+        <w:t xml:space="preserve"> runtime — DOCX · ODT · Markdown · HTML · PDF/</w:t>
+      </w:r>
+      <w:r>
+        <w:rPr>
+          <w:vertAlign w:val="superscript"/>
+        </w:rPr>
+        <w:t xml:space="preserve">A</w:t>
       </w:r>
     </w:p>
     <w:sectPr>

</xml_diff>

<commit_message>
Keep subscripts as a smaller lowered face.
</commit_message>
<xml_diff>
--- a/docs/assets/letter.docx
+++ b/docs/assets/letter.docx
@@ -97,7 +97,16 @@
         <w:t xml:space="preserve">guess</w:t>
       </w:r>
       <w:r>
-        <w:t xml:space="preserve">.</w:t>
+        <w:t xml:space="preserve">. Wet cargo is H</w:t>
+      </w:r>
+      <w:r>
+        <w:rPr>
+          <w:vertAlign w:val="subscript"/>
+        </w:rPr>
+        <w:t xml:space="preserve">2</w:t>
+      </w:r>
+      <w:r>
+        <w:t xml:space="preserve">O only.</w:t>
       </w:r>
     </w:p>
     <w:p>
@@ -315,7 +324,16 @@
         </w:numPr>
       </w:pPr>
       <w:r>
-        <w:t xml:space="preserve">Bay 4, not bay 2</w:t>
+        <w:t xml:space="preserve">Bay 4, H</w:t>
+      </w:r>
+      <w:r>
+        <w:rPr>
+          <w:vertAlign w:val="subscript"/>
+        </w:rPr>
+        <w:t xml:space="preserve">2</w:t>
+      </w:r>
+      <w:r>
+        <w:t xml:space="preserve">O seals intact</w:t>
       </w:r>
     </w:p>
     <w:p>
@@ -423,6 +441,18 @@
           <w:vertAlign w:val="superscript"/>
         </w:rPr>
         <w:t xml:space="preserve">A</w:t>
+      </w:r>
+      <w:r>
+        <w:t xml:space="preserve">. Seals: H</w:t>
+      </w:r>
+      <w:r>
+        <w:rPr>
+          <w:vertAlign w:val="subscript"/>
+        </w:rPr>
+        <w:t xml:space="preserve">2</w:t>
+      </w:r>
+      <w:r>
+        <w:t xml:space="preserve">O.</w:t>
       </w:r>
     </w:p>
     <w:sectPr>

</xml_diff>

<commit_message>
Keep table headers as teal PDF fills.
</commit_message>
<xml_diff>
--- a/docs/assets/letter.docx
+++ b/docs/assets/letter.docx
@@ -137,9 +137,13 @@
         <w:gridCol w:w="2000"/>
       </w:tblGrid>
       <w:tr>
-        <w:tc>
-          <w:tcPr>
-            <w:tcW w:w="2000" w:type="dxa"/>
+        <w:trPr>
+          <w:tblHeader/>
+        </w:trPr>
+        <w:tc>
+          <w:tcPr>
+            <w:tcW w:w="2000" w:type="dxa"/>
+            <w:shd w:val="clear" w:fill="CCFBF1"/>
           </w:tcPr>
           <w:p>
             <w:r>
@@ -153,6 +157,7 @@
         <w:tc>
           <w:tcPr>
             <w:tcW w:w="2000" w:type="dxa"/>
+            <w:shd w:val="clear" w:fill="CCFBF1"/>
           </w:tcPr>
           <w:p>
             <w:r>
@@ -166,6 +171,7 @@
         <w:tc>
           <w:tcPr>
             <w:tcW w:w="2000" w:type="dxa"/>
+            <w:shd w:val="clear" w:fill="CCFBF1"/>
           </w:tcPr>
           <w:p>
             <w:r>

</xml_diff>

<commit_message>
Put the harbor mark in the demo letter and prove it.
SCORE gap was GitHub convert shots with no picture. letter.md now embeds docs/assets/mark.png. Convert writes PDF/A XObject, HTML img, DOCX media, ODT Pictures. prove identical:true. No Hangul trivia.
</commit_message>
<xml_diff>
--- a/docs/assets/letter.docx
+++ b/docs/assets/letter.docx
@@ -1,6 +1,6 @@
 
 <file path=word/document.xml><?xml version="1.0" encoding="utf-8"?>
-<w:document xmlns:w="http://schemas.openxmlformats.org/wordprocessingml/2006/main" xmlns:r="http://schemas.openxmlformats.org/officeDocument/2006/relationships">
+<w:document xmlns:w="http://schemas.openxmlformats.org/wordprocessingml/2006/main" xmlns:r="http://schemas.openxmlformats.org/officeDocument/2006/relationships" xmlns:wp="http://schemas.openxmlformats.org/drawingml/2006/wordprocessingDrawing" xmlns:a="http://schemas.openxmlformats.org/drawingml/2006/main" xmlns:pic="http://schemas.openxmlformats.org/drawingml/2006/picture">
   <w:body>
     <w:p>
       <w:pPr>
@@ -28,6 +28,47 @@
           <w:szCs w:val="28"/>
         </w:rPr>
         <w:t xml:space="preserve">Delivery confirmation — order 48291</w:t>
+      </w:r>
+    </w:p>
+    <w:p>
+      <w:r>
+        <w:drawing>
+          <wp:inline distT="0" distB="0" distL="0" distR="0">
+            <wp:extent cx="152400" cy="152400"/>
+            <wp:effectExtent l="0" t="0" r="0" b="0"/>
+            <wp:docPr id="3" name="Picture 3" descr="Harbor mark"/>
+            <wp:cNvGraphicFramePr>
+              <a:graphicFrameLocks noChangeAspect="1"/>
+            </wp:cNvGraphicFramePr>
+            <a:graphic>
+              <a:graphicData uri="http://schemas.openxmlformats.org/drawingml/2006/picture">
+                <pic:pic>
+                  <pic:nvPicPr>
+                    <pic:cNvPr id="0" name="image3" descr="Harbor mark"/>
+                    <pic:cNvPicPr>
+                      <a:picLocks noChangeAspect="1"/>
+                    </pic:cNvPicPr>
+                  </pic:nvPicPr>
+                  <pic:blipFill>
+                    <a:blip r:embed="rId3"/>
+                    <a:stretch>
+                      <a:fillRect/>
+                    </a:stretch>
+                  </pic:blipFill>
+                  <pic:spPr>
+                    <a:xfrm>
+                      <a:off x="0" y="0"/>
+                      <a:ext cx="152400" cy="152400"/>
+                    </a:xfrm>
+                    <a:prstGeom prst="rect">
+                      <a:avLst/>
+                    </a:prstGeom>
+                  </pic:spPr>
+                </pic:pic>
+              </a:graphicData>
+            </a:graphic>
+          </wp:inline>
+        </w:drawing>
       </w:r>
     </w:p>
     <w:p>
@@ -431,7 +472,7 @@
       </w:r>
     </w:p>
     <w:p>
-      <w:hyperlink r:id="rId3">
+      <w:hyperlink r:id="rId4">
         <w:r>
           <w:rPr>
             <w:u w:val="single"/>

</xml_diff>

<commit_message>
Tighten letter PDF, DOCX, ODT, and HTML toward WeasyPrint.
Lock table, list, heading, mark, code, and page-margin tightness in the first-class codecs. Refresh convert shots and lockstep README hashes to the live capsule. Prove stays distinct. Letter page vs WeasyPrint remains open.
</commit_message>
<xml_diff>
--- a/docs/assets/letter.docx
+++ b/docs/assets/letter.docx
@@ -5,13 +5,18 @@
     <w:p>
       <w:pPr>
         <w:pStyle w:val="Heading1"/>
+        <w:pBdr>
+          <w:bottom w:val="single" w:sz="18" w:space="5" w:color="134E4A"/>
+        </w:pBdr>
         <w:outlineLvl w:val="0"/>
-      </w:pPr>
-      <w:r>
-        <w:rPr>
+        <w:spacing w:before="240" w:after="160" w:line="288" w:lineRule="auto"/>
+      </w:pPr>
+      <w:r>
+        <w:rPr>
+          <w:rFonts w:ascii="Segoe UI" w:hAnsi="Segoe UI" w:cs="Segoe UI"/>
           <w:b/>
-          <w:sz w:val="36"/>
-          <w:szCs w:val="36"/>
+          <w:color w:val="134E4A"/>
+          <w:spacing w:val="-6"/>
         </w:rPr>
         <w:t xml:space="preserve">Northwind Freight</w:t>
       </w:r>
@@ -19,30 +24,37 @@
     <w:p>
       <w:pPr>
         <w:pStyle w:val="Heading2"/>
+        <w:pBdr>
+          <w:bottom w:val="single" w:sz="12" w:space="2" w:color="0D9488"/>
+        </w:pBdr>
         <w:outlineLvl w:val="1"/>
-      </w:pPr>
-      <w:r>
-        <w:rPr>
+        <w:spacing w:before="200" w:after="80" w:line="288" w:lineRule="auto"/>
+      </w:pPr>
+      <w:r>
+        <w:rPr>
+          <w:rFonts w:ascii="Segoe UI" w:hAnsi="Segoe UI" w:cs="Segoe UI"/>
           <w:b/>
-          <w:sz w:val="28"/>
-          <w:szCs w:val="28"/>
+          <w:color w:val="134E4A"/>
         </w:rPr>
         <w:t xml:space="preserve">Delivery confirmation — order 48291</w:t>
       </w:r>
     </w:p>
     <w:p>
+      <w:pPr>
+        <w:spacing w:before="144" w:after="168"/>
+      </w:pPr>
       <w:r>
         <w:drawing>
           <wp:inline distT="0" distB="0" distL="0" distR="0">
-            <wp:extent cx="152400" cy="152400"/>
+            <wp:extent cx="304800" cy="304800"/>
             <wp:effectExtent l="0" t="0" r="0" b="0"/>
             <wp:docPr id="3" name="Picture 3" descr="Harbor mark"/>
             <wp:cNvGraphicFramePr>
-              <a:graphicFrameLocks noChangeAspect="1"/>
+              <a:graphicFrameLocks xmlns:a="http://schemas.openxmlformats.org/drawingml/2006/main" noChangeAspect="1"/>
             </wp:cNvGraphicFramePr>
-            <a:graphic>
+            <a:graphic xmlns:a="http://schemas.openxmlformats.org/drawingml/2006/main">
               <a:graphicData uri="http://schemas.openxmlformats.org/drawingml/2006/picture">
-                <pic:pic>
+                <pic:pic xmlns:pic="http://schemas.openxmlformats.org/drawingml/2006/picture">
                   <pic:nvPicPr>
                     <pic:cNvPr id="0" name="image3" descr="Harbor mark"/>
                     <pic:cNvPicPr>
@@ -58,7 +70,7 @@
                   <pic:spPr>
                     <a:xfrm>
                       <a:off x="0" y="0"/>
-                      <a:ext cx="152400" cy="152400"/>
+                      <a:ext cx="304800" cy="304800"/>
                     </a:xfrm>
                     <a:prstGeom prst="rect">
                       <a:avLst/>
@@ -72,81 +84,153 @@
       </w:r>
     </w:p>
     <w:p>
-      <w:r>
+      <w:pPr>
+        <w:spacing w:after="168" w:line="276" w:lineRule="auto"/>
+      </w:pPr>
+      <w:r>
+        <w:rPr>
+          <w:rFonts w:ascii="Segoe UI" w:hAnsi="Segoe UI" w:cs="Segoe UI"/>
+          <w:color w:val="134E4A"/>
+        </w:rPr>
         <w:t xml:space="preserve">6 September 2026</w:t>
       </w:r>
     </w:p>
     <w:p>
-      <w:r>
+      <w:pPr>
+        <w:spacing w:after="168" w:line="276" w:lineRule="auto"/>
+      </w:pPr>
+      <w:r>
+        <w:rPr>
+          <w:rFonts w:ascii="Segoe UI" w:hAnsi="Segoe UI" w:cs="Segoe UI"/>
+          <w:color w:val="134E4A"/>
+        </w:rPr>
         <w:t xml:space="preserve">To: operations desk, Duisburg terminal.</w:t>
       </w:r>
     </w:p>
     <w:p>
-      <w:r>
+      <w:pPr>
+        <w:spacing w:after="168" w:line="276" w:lineRule="auto"/>
+      </w:pPr>
+      <w:r>
+        <w:rPr>
+          <w:rFonts w:ascii="Segoe UI" w:hAnsi="Segoe UI" w:cs="Segoe UI"/>
+          <w:color w:val="134E4A"/>
+        </w:rPr>
         <w:t xml:space="preserve">The shipment left Busan on 4 September and is booked on the 11 September rail window. This is a flow document: one convert, </w:t>
       </w:r>
       <w:r>
         <w:rPr>
+          <w:rStyle w:val="Mark"/>
+          <w:color w:val="134E4A"/>
           <w:highlight w:val="yellow"/>
+          <w:bdr w:val="single" w:sz="4" w:space="2" w:color="FDE68A"/>
+          <w:shd w:val="clear" w:fill="FDE68A"/>
+          <w:rFonts w:ascii="Segoe UI" w:hAnsi="Segoe UI" w:cs="Segoe UI"/>
         </w:rPr>
         <w:t xml:space="preserve">three hashes</w:t>
       </w:r>
       <w:r>
+        <w:rPr>
+          <w:rFonts w:ascii="Segoe UI" w:hAnsi="Segoe UI" w:cs="Segoe UI"/>
+          <w:color w:val="134E4A"/>
+        </w:rPr>
         <w:t xml:space="preserve">, </w:t>
       </w:r>
       <w:r>
         <w:rPr>
+          <w:rFonts w:ascii="Segoe UI" w:hAnsi="Segoe UI" w:cs="Segoe UI"/>
           <w:b/>
+          <w:color w:val="134E4A"/>
         </w:rPr>
         <w:t xml:space="preserve">GPU-free</w:t>
       </w:r>
       <w:r>
+        <w:rPr>
+          <w:rFonts w:ascii="Segoe UI" w:hAnsi="Segoe UI" w:cs="Segoe UI"/>
+          <w:color w:val="134E4A"/>
+        </w:rPr>
         <w:t xml:space="preserve">. Run </w:t>
       </w:r>
       <w:r>
         <w:rPr>
           <w:rStyle w:val="Code"/>
+          <w:rFonts w:ascii="Consolas" w:hAnsi="Consolas"/>
+          <w:color w:val="134E4A"/>
+          <w:sz w:val="20"/>
+          <w:szCs w:val="20"/>
+          <w:bdr w:val="single" w:sz="4" w:space="4" w:color="CCFBF1"/>
           <w:shd w:val="clear" w:fill="CCFBF1"/>
         </w:rPr>
         <w:t xml:space="preserve">prove</w:t>
       </w:r>
       <w:r>
+        <w:rPr>
+          <w:rFonts w:ascii="Segoe UI" w:hAnsi="Segoe UI" w:cs="Segoe UI"/>
+          <w:color w:val="134E4A"/>
+        </w:rPr>
         <w:t xml:space="preserve"> twice with the same fonts and the PDF/</w:t>
       </w:r>
       <w:r>
         <w:rPr>
+          <w:rStyle w:val="Superscript"/>
+          <w:rFonts w:ascii="Segoe UI" w:hAnsi="Segoe UI" w:cs="Segoe UI"/>
           <w:vertAlign w:val="superscript"/>
+          <w:color w:val="134E4A"/>
         </w:rPr>
         <w:t xml:space="preserve">A</w:t>
       </w:r>
       <w:r>
+        <w:rPr>
+          <w:rFonts w:ascii="Segoe UI" w:hAnsi="Segoe UI" w:cs="Segoe UI"/>
+          <w:color w:val="134E4A"/>
+        </w:rPr>
         <w:t xml:space="preserve"> bytes match </w:t>
       </w:r>
       <w:r>
         <w:rPr>
+          <w:rFonts w:ascii="Segoe UI" w:hAnsi="Segoe UI" w:cs="Segoe UI"/>
           <w:i/>
+          <w:color w:val="134E4A"/>
         </w:rPr>
         <w:t xml:space="preserve">byte-for-byte</w:t>
       </w:r>
       <w:r>
+        <w:rPr>
+          <w:rFonts w:ascii="Segoe UI" w:hAnsi="Segoe UI" w:cs="Segoe UI"/>
+          <w:color w:val="134E4A"/>
+        </w:rPr>
         <w:t xml:space="preserve">. Agents </w:t>
       </w:r>
       <w:r>
         <w:rPr>
+          <w:rStyle w:val="Strike"/>
+          <w:rFonts w:ascii="Segoe UI" w:hAnsi="Segoe UI" w:cs="Segoe UI"/>
           <w:strike/>
+          <w:color w:val="134E4A"/>
         </w:rPr>
         <w:t xml:space="preserve">guess</w:t>
       </w:r>
       <w:r>
+        <w:rPr>
+          <w:rFonts w:ascii="Segoe UI" w:hAnsi="Segoe UI" w:cs="Segoe UI"/>
+          <w:color w:val="134E4A"/>
+        </w:rPr>
         <w:t xml:space="preserve">. Wet cargo is H</w:t>
       </w:r>
       <w:r>
         <w:rPr>
+          <w:rStyle w:val="Subscript"/>
+          <w:rFonts w:ascii="Segoe UI" w:hAnsi="Segoe UI" w:cs="Segoe UI"/>
           <w:vertAlign w:val="subscript"/>
+          <w:color w:val="134E4A"/>
         </w:rPr>
         <w:t xml:space="preserve">2</w:t>
       </w:r>
       <w:r>
+        <w:rPr>
+          <w:rFonts w:ascii="Segoe UI" w:hAnsi="Segoe UI" w:cs="Segoe UI"/>
+          <w:color w:val="134E4A"/>
+        </w:rPr>
         <w:t xml:space="preserve">O only.</w:t>
       </w:r>
     </w:p>
@@ -156,26 +240,61 @@
         <w:pBdr>
           <w:left w:val="single" w:sz="24" w:space="4" w:color="134E4A"/>
         </w:pBdr>
-      </w:pPr>
-      <w:r>
+        <w:ind w:left="720"/>
+        <w:spacing w:before="120" w:after="240" w:line="276" w:lineRule="auto"/>
+      </w:pPr>
+      <w:r>
+        <w:rPr>
+          <w:rFonts w:ascii="Segoe UI" w:hAnsi="Segoe UI" w:cs="Segoe UI"/>
+          <w:color w:val="134E4A"/>
+        </w:rPr>
         <w:t xml:space="preserve">Replay is evidence. Same fonts, same bytes.</w:t>
       </w:r>
     </w:p>
     <w:p>
       <w:pPr>
         <w:pStyle w:val="CodeBlock"/>
+        <w:pBdr>
+          <w:top w:val="single" w:sz="72" w:space="0" w:color="CCFBF1"/>
+          <w:bottom w:val="single" w:sz="72" w:space="0" w:color="CCFBF1"/>
+        </w:pBdr>
         <w:shd w:val="clear" w:fill="CCFBF1"/>
-      </w:pPr>
-      <w:r>
+        <w:ind w:left="240" w:right="240"/>
+        <w:spacing w:before="144" w:after="240"/>
+      </w:pPr>
+      <w:r>
+        <w:rPr>
+          <w:rFonts w:ascii="Consolas" w:hAnsi="Consolas"/>
+          <w:color w:val="134E4A"/>
+        </w:rPr>
         <w:t xml:space="preserve">docagent prove examples/letter.md</w:t>
       </w:r>
     </w:p>
     <w:tbl>
-      <w:tblPr/>
+      <w:tblPr>
+        <w:tblStyle w:val="TableGrid"/>
+        <w:tblW w:w="10585" w:type="dxa"/>
+        <w:tblCellSpacing w:w="0" w:type="dxa"/>
+        <w:tblBorders>
+          <w:top w:val="single" w:sz="6" w:space="0" w:color="CBD5E1"/>
+          <w:left w:val="single" w:sz="6" w:space="0" w:color="CBD5E1"/>
+          <w:bottom w:val="single" w:sz="6" w:space="0" w:color="CBD5E1"/>
+          <w:right w:val="single" w:sz="6" w:space="0" w:color="CBD5E1"/>
+          <w:insideH w:val="single" w:sz="6" w:space="0" w:color="CBD5E1"/>
+          <w:insideV w:val="single" w:sz="6" w:space="0" w:color="CBD5E1"/>
+        </w:tblBorders>
+        <w:tblCellMar>
+          <w:top w:w="96" w:type="dxa"/>
+          <w:left w:w="156" w:type="dxa"/>
+          <w:bottom w:w="96" w:type="dxa"/>
+          <w:right w:w="156" w:type="dxa"/>
+        </w:tblCellMar>
+        <w:tblLook w:firstRow="1" w:lastRow="0" w:firstColumn="0" w:lastColumn="0" w:noHBand="0" w:noVBand="1" w:val="04A0"/>
+      </w:tblPr>
       <w:tblGrid>
-        <w:gridCol w:w="2000"/>
-        <w:gridCol w:w="2000"/>
-        <w:gridCol w:w="2000"/>
+        <w:gridCol w:w="3528"/>
+        <w:gridCol w:w="3528"/>
+        <w:gridCol w:w="3529"/>
       </w:tblGrid>
       <w:tr>
         <w:trPr>
@@ -183,13 +302,27 @@
         </w:trPr>
         <w:tc>
           <w:tcPr>
-            <w:tcW w:w="2000" w:type="dxa"/>
+            <w:tcW w:w="3528" w:type="dxa"/>
+            <w:tcBorders>
+              <w:bottom w:val="single" w:sz="12" w:space="0" w:color="0D9488"/>
+            </w:tcBorders>
             <w:shd w:val="clear" w:fill="CCFBF1"/>
+            <w:tcMar>
+              <w:top w:w="96" w:type="dxa"/>
+              <w:left w:w="156" w:type="dxa"/>
+              <w:bottom w:w="96" w:type="dxa"/>
+              <w:right w:w="156" w:type="dxa"/>
+            </w:tcMar>
+            <w:vAlign w:val="top"/>
           </w:tcPr>
           <w:p>
             <w:r>
               <w:rPr>
+                <w:rFonts w:ascii="Segoe UI" w:hAnsi="Segoe UI" w:cs="Segoe UI"/>
                 <w:b/>
+                <w:color w:val="134E4A"/>
+                <w:sz w:val="23"/>
+                <w:szCs w:val="23"/>
               </w:rPr>
               <w:t xml:space="preserve">Hop</w:t>
             </w:r>
@@ -197,13 +330,27 @@
         </w:tc>
         <w:tc>
           <w:tcPr>
-            <w:tcW w:w="2000" w:type="dxa"/>
+            <w:tcW w:w="3528" w:type="dxa"/>
+            <w:tcBorders>
+              <w:bottom w:val="single" w:sz="12" w:space="0" w:color="0D9488"/>
+            </w:tcBorders>
             <w:shd w:val="clear" w:fill="CCFBF1"/>
+            <w:tcMar>
+              <w:top w:w="96" w:type="dxa"/>
+              <w:left w:w="156" w:type="dxa"/>
+              <w:bottom w:w="96" w:type="dxa"/>
+              <w:right w:w="156" w:type="dxa"/>
+            </w:tcMar>
+            <w:vAlign w:val="top"/>
           </w:tcPr>
           <w:p>
             <w:r>
               <w:rPr>
+                <w:rFonts w:ascii="Segoe UI" w:hAnsi="Segoe UI" w:cs="Segoe UI"/>
                 <w:b/>
+                <w:color w:val="134E4A"/>
+                <w:sz w:val="23"/>
+                <w:szCs w:val="23"/>
               </w:rPr>
               <w:t xml:space="preserve">File</w:t>
             </w:r>
@@ -211,13 +358,27 @@
         </w:tc>
         <w:tc>
           <w:tcPr>
-            <w:tcW w:w="2000" w:type="dxa"/>
+            <w:tcW w:w="3529" w:type="dxa"/>
+            <w:tcBorders>
+              <w:bottom w:val="single" w:sz="12" w:space="0" w:color="0D9488"/>
+            </w:tcBorders>
             <w:shd w:val="clear" w:fill="CCFBF1"/>
+            <w:tcMar>
+              <w:top w:w="96" w:type="dxa"/>
+              <w:left w:w="156" w:type="dxa"/>
+              <w:bottom w:w="96" w:type="dxa"/>
+              <w:right w:w="156" w:type="dxa"/>
+            </w:tcMar>
+            <w:vAlign w:val="top"/>
           </w:tcPr>
           <w:p>
             <w:r>
               <w:rPr>
+                <w:rFonts w:ascii="Segoe UI" w:hAnsi="Segoe UI" w:cs="Segoe UI"/>
                 <w:b/>
+                <w:color w:val="134E4A"/>
+                <w:sz w:val="23"/>
+                <w:szCs w:val="23"/>
               </w:rPr>
               <w:t xml:space="preserve">Proof</w:t>
             </w:r>
@@ -227,30 +388,69 @@
       <w:tr>
         <w:tc>
           <w:tcPr>
-            <w:tcW w:w="2000" w:type="dxa"/>
+            <w:tcW w:w="3528" w:type="dxa"/>
+            <w:tcMar>
+              <w:top w:w="96" w:type="dxa"/>
+              <w:left w:w="156" w:type="dxa"/>
+              <w:bottom w:w="96" w:type="dxa"/>
+              <w:right w:w="156" w:type="dxa"/>
+            </w:tcMar>
+            <w:vAlign w:val="top"/>
           </w:tcPr>
           <w:p>
             <w:r>
+              <w:rPr>
+                <w:rFonts w:ascii="Segoe UI" w:hAnsi="Segoe UI" w:cs="Segoe UI"/>
+                <w:color w:val="134E4A"/>
+                <w:sz w:val="23"/>
+                <w:szCs w:val="23"/>
+              </w:rPr>
               <w:t xml:space="preserve">Input</w:t>
             </w:r>
           </w:p>
         </w:tc>
         <w:tc>
           <w:tcPr>
-            <w:tcW w:w="2000" w:type="dxa"/>
+            <w:tcW w:w="3528" w:type="dxa"/>
+            <w:tcMar>
+              <w:top w:w="96" w:type="dxa"/>
+              <w:left w:w="156" w:type="dxa"/>
+              <w:bottom w:w="96" w:type="dxa"/>
+              <w:right w:w="156" w:type="dxa"/>
+            </w:tcMar>
+            <w:vAlign w:val="top"/>
           </w:tcPr>
           <w:p>
             <w:r>
+              <w:rPr>
+                <w:rFonts w:ascii="Segoe UI" w:hAnsi="Segoe UI" w:cs="Segoe UI"/>
+                <w:color w:val="134E4A"/>
+                <w:sz w:val="23"/>
+                <w:szCs w:val="23"/>
+              </w:rPr>
               <w:t xml:space="preserve">letter.md</w:t>
             </w:r>
           </w:p>
         </w:tc>
         <w:tc>
           <w:tcPr>
-            <w:tcW w:w="2000" w:type="dxa"/>
+            <w:tcW w:w="3529" w:type="dxa"/>
+            <w:tcMar>
+              <w:top w:w="96" w:type="dxa"/>
+              <w:left w:w="156" w:type="dxa"/>
+              <w:bottom w:w="96" w:type="dxa"/>
+              <w:right w:w="156" w:type="dxa"/>
+            </w:tcMar>
+            <w:vAlign w:val="top"/>
           </w:tcPr>
           <w:p>
             <w:r>
+              <w:rPr>
+                <w:rFonts w:ascii="Segoe UI" w:hAnsi="Segoe UI" w:cs="Segoe UI"/>
+                <w:color w:val="134E4A"/>
+                <w:sz w:val="23"/>
+                <w:szCs w:val="23"/>
+              </w:rPr>
               <w:t xml:space="preserve">input SHA-256</w:t>
             </w:r>
           </w:p>
@@ -259,30 +459,69 @@
       <w:tr>
         <w:tc>
           <w:tcPr>
-            <w:tcW w:w="2000" w:type="dxa"/>
+            <w:tcW w:w="3528" w:type="dxa"/>
+            <w:tcMar>
+              <w:top w:w="96" w:type="dxa"/>
+              <w:left w:w="156" w:type="dxa"/>
+              <w:bottom w:w="96" w:type="dxa"/>
+              <w:right w:w="156" w:type="dxa"/>
+            </w:tcMar>
+            <w:vAlign w:val="top"/>
           </w:tcPr>
           <w:p>
             <w:r>
+              <w:rPr>
+                <w:rFonts w:ascii="Segoe UI" w:hAnsi="Segoe UI" w:cs="Segoe UI"/>
+                <w:color w:val="134E4A"/>
+                <w:sz w:val="23"/>
+                <w:szCs w:val="23"/>
+              </w:rPr>
               <w:t xml:space="preserve">Plan</w:t>
             </w:r>
           </w:p>
         </w:tc>
         <w:tc>
           <w:tcPr>
-            <w:tcW w:w="2000" w:type="dxa"/>
+            <w:tcW w:w="3528" w:type="dxa"/>
+            <w:tcMar>
+              <w:top w:w="96" w:type="dxa"/>
+              <w:left w:w="156" w:type="dxa"/>
+              <w:bottom w:w="96" w:type="dxa"/>
+              <w:right w:w="156" w:type="dxa"/>
+            </w:tcMar>
+            <w:vAlign w:val="top"/>
           </w:tcPr>
           <w:p>
             <w:r>
+              <w:rPr>
+                <w:rFonts w:ascii="Segoe UI" w:hAnsi="Segoe UI" w:cs="Segoe UI"/>
+                <w:color w:val="134E4A"/>
+                <w:sz w:val="23"/>
+                <w:szCs w:val="23"/>
+              </w:rPr>
               <w:t xml:space="preserve">layout i32 @ 1/7200 in</w:t>
             </w:r>
           </w:p>
         </w:tc>
         <w:tc>
           <w:tcPr>
-            <w:tcW w:w="2000" w:type="dxa"/>
+            <w:tcW w:w="3529" w:type="dxa"/>
+            <w:tcMar>
+              <w:top w:w="96" w:type="dxa"/>
+              <w:left w:w="156" w:type="dxa"/>
+              <w:bottom w:w="96" w:type="dxa"/>
+              <w:right w:w="156" w:type="dxa"/>
+            </w:tcMar>
+            <w:vAlign w:val="top"/>
           </w:tcPr>
           <w:p>
             <w:r>
+              <w:rPr>
+                <w:rFonts w:ascii="Segoe UI" w:hAnsi="Segoe UI" w:cs="Segoe UI"/>
+                <w:color w:val="134E4A"/>
+                <w:sz w:val="23"/>
+                <w:szCs w:val="23"/>
+              </w:rPr>
               <w:t xml:space="preserve">plan SHA-256</w:t>
             </w:r>
           </w:p>
@@ -291,39 +530,89 @@
       <w:tr>
         <w:tc>
           <w:tcPr>
-            <w:tcW w:w="2000" w:type="dxa"/>
+            <w:tcW w:w="3528" w:type="dxa"/>
+            <w:tcMar>
+              <w:top w:w="96" w:type="dxa"/>
+              <w:left w:w="156" w:type="dxa"/>
+              <w:bottom w:w="96" w:type="dxa"/>
+              <w:right w:w="156" w:type="dxa"/>
+            </w:tcMar>
+            <w:vAlign w:val="top"/>
           </w:tcPr>
           <w:p>
             <w:r>
+              <w:rPr>
+                <w:rFonts w:ascii="Segoe UI" w:hAnsi="Segoe UI" w:cs="Segoe UI"/>
+                <w:color w:val="134E4A"/>
+                <w:sz w:val="23"/>
+                <w:szCs w:val="23"/>
+              </w:rPr>
               <w:t xml:space="preserve">Output</w:t>
             </w:r>
           </w:p>
         </w:tc>
         <w:tc>
           <w:tcPr>
-            <w:tcW w:w="2000" w:type="dxa"/>
+            <w:tcW w:w="3528" w:type="dxa"/>
+            <w:tcMar>
+              <w:top w:w="96" w:type="dxa"/>
+              <w:left w:w="156" w:type="dxa"/>
+              <w:bottom w:w="96" w:type="dxa"/>
+              <w:right w:w="156" w:type="dxa"/>
+            </w:tcMar>
+            <w:vAlign w:val="top"/>
           </w:tcPr>
           <w:p>
             <w:r>
+              <w:rPr>
+                <w:rFonts w:ascii="Segoe UI" w:hAnsi="Segoe UI" w:cs="Segoe UI"/>
+                <w:color w:val="134E4A"/>
+                <w:sz w:val="23"/>
+                <w:szCs w:val="23"/>
+              </w:rPr>
               <w:t xml:space="preserve">PDF/</w:t>
             </w:r>
             <w:r>
               <w:rPr>
+                <w:rStyle w:val="Superscript"/>
+                <w:rFonts w:ascii="Segoe UI" w:hAnsi="Segoe UI" w:cs="Segoe UI"/>
                 <w:vertAlign w:val="superscript"/>
+                <w:color w:val="134E4A"/>
+                <w:sz w:val="23"/>
+                <w:szCs w:val="23"/>
               </w:rPr>
               <w:t xml:space="preserve">A</w:t>
             </w:r>
             <w:r>
+              <w:rPr>
+                <w:rFonts w:ascii="Segoe UI" w:hAnsi="Segoe UI" w:cs="Segoe UI"/>
+                <w:color w:val="134E4A"/>
+                <w:sz w:val="23"/>
+                <w:szCs w:val="23"/>
+              </w:rPr>
               <w:t xml:space="preserve"> · HTML · ODT</w:t>
             </w:r>
           </w:p>
         </w:tc>
         <w:tc>
           <w:tcPr>
-            <w:tcW w:w="2000" w:type="dxa"/>
+            <w:tcW w:w="3529" w:type="dxa"/>
+            <w:tcMar>
+              <w:top w:w="96" w:type="dxa"/>
+              <w:left w:w="156" w:type="dxa"/>
+              <w:bottom w:w="96" w:type="dxa"/>
+              <w:right w:w="156" w:type="dxa"/>
+            </w:tcMar>
+            <w:vAlign w:val="top"/>
           </w:tcPr>
           <w:p>
             <w:r>
+              <w:rPr>
+                <w:rFonts w:ascii="Segoe UI" w:hAnsi="Segoe UI" w:cs="Segoe UI"/>
+                <w:color w:val="134E4A"/>
+                <w:sz w:val="23"/>
+                <w:szCs w:val="23"/>
+              </w:rPr>
               <w:t xml:space="preserve">output SHA-256</w:t>
             </w:r>
           </w:p>
@@ -334,147 +623,250 @@
       <w:pPr>
         <w:pStyle w:val="HorizontalLine"/>
         <w:pBdr>
-          <w:bottom w:val="single" w:sz="12" w:space="1" w:color="134E4A"/>
+          <w:bottom w:val="single" w:sz="18" w:space="1" w:color="134E4A"/>
         </w:pBdr>
-      </w:pPr>
-    </w:p>
-    <w:p>
-      <w:r>
+        <w:spacing w:before="264" w:after="264"/>
+      </w:pPr>
+      <w:r>
+        <w:t/>
+      </w:r>
+    </w:p>
+    <w:p>
+      <w:pPr>
+        <w:spacing w:after="168" w:line="276" w:lineRule="auto"/>
+      </w:pPr>
+      <w:r>
+        <w:rPr>
+          <w:rFonts w:ascii="Segoe UI" w:hAnsi="Segoe UI" w:cs="Segoe UI"/>
+          <w:color w:val="134E4A"/>
+        </w:rPr>
         <w:t xml:space="preserve">Please confirm before </w:t>
       </w:r>
       <w:r>
         <w:rPr>
+          <w:rStyle w:val="Underline"/>
+          <w:rFonts w:ascii="Segoe UI" w:hAnsi="Segoe UI" w:cs="Segoe UI"/>
           <w:u w:val="single"/>
+          <w:color w:val="134E4A"/>
         </w:rPr>
         <w:t xml:space="preserve">09:00 local</w:t>
       </w:r>
       <w:r>
+        <w:rPr>
+          <w:rFonts w:ascii="Segoe UI" w:hAnsi="Segoe UI" w:cs="Segoe UI"/>
+          <w:color w:val="134E4A"/>
+        </w:rPr>
         <w:t xml:space="preserve">:</w:t>
       </w:r>
     </w:p>
     <w:p>
       <w:pPr>
+        <w:pStyle w:val="ListParagraph"/>
         <w:numPr>
           <w:ilvl w:val="0"/>
-          <w:numId w:val="1"/>
+          <w:numId w:val="4"/>
         </w:numPr>
-      </w:pPr>
-      <w:r>
-        <w:t xml:space="preserve">[x] Receiving dock is clear</w:t>
-      </w:r>
-    </w:p>
-    <w:p>
-      <w:pPr>
+        <w:ind w:left="300" w:hanging="240"/>
+        <w:spacing w:after="60"/>
+      </w:pPr>
+      <w:r>
+        <w:rPr>
+          <w:rFonts w:ascii="Segoe UI" w:hAnsi="Segoe UI" w:cs="Segoe UI"/>
+          <w:color w:val="134E4A"/>
+        </w:rPr>
+        <w:t xml:space="preserve">Receiving dock is clear</w:t>
+      </w:r>
+    </w:p>
+    <w:p>
+      <w:pPr>
+        <w:pStyle w:val="ListParagraph"/>
         <w:numPr>
           <w:ilvl w:val="1"/>
           <w:numId w:val="1"/>
         </w:numPr>
-      </w:pPr>
-      <w:r>
+        <w:ind w:left="600" w:hanging="240"/>
+        <w:spacing w:after="84"/>
+      </w:pPr>
+      <w:r>
+        <w:rPr>
+          <w:rFonts w:ascii="Segoe UI" w:hAnsi="Segoe UI" w:cs="Segoe UI"/>
+          <w:color w:val="134E4A"/>
+        </w:rPr>
         <w:t xml:space="preserve">Bay 4, H</w:t>
       </w:r>
       <w:r>
         <w:rPr>
+          <w:rStyle w:val="Subscript"/>
+          <w:rFonts w:ascii="Segoe UI" w:hAnsi="Segoe UI" w:cs="Segoe UI"/>
           <w:vertAlign w:val="subscript"/>
+          <w:color w:val="134E4A"/>
         </w:rPr>
         <w:t xml:space="preserve">2</w:t>
       </w:r>
       <w:r>
+        <w:rPr>
+          <w:rFonts w:ascii="Segoe UI" w:hAnsi="Segoe UI" w:cs="Segoe UI"/>
+          <w:color w:val="134E4A"/>
+        </w:rPr>
         <w:t xml:space="preserve">O seals intact</w:t>
       </w:r>
     </w:p>
     <w:p>
       <w:pPr>
+        <w:pStyle w:val="ListParagraph"/>
         <w:numPr>
           <w:ilvl w:val="0"/>
-          <w:numId w:val="1"/>
+          <w:numId w:val="4"/>
         </w:numPr>
-      </w:pPr>
-      <w:r>
-        <w:t xml:space="preserve">[x] Capsule hashes travel with the files</w:t>
-      </w:r>
-    </w:p>
-    <w:p>
-      <w:pPr>
+        <w:ind w:left="300" w:hanging="240"/>
+        <w:spacing w:after="84"/>
+      </w:pPr>
+      <w:r>
+        <w:rPr>
+          <w:rFonts w:ascii="Segoe UI" w:hAnsi="Segoe UI" w:cs="Segoe UI"/>
+          <w:color w:val="134E4A"/>
+        </w:rPr>
+        <w:t xml:space="preserve">Capsule hashes travel with the files</w:t>
+      </w:r>
+    </w:p>
+    <w:p>
+      <w:pPr>
+        <w:pStyle w:val="ListParagraph"/>
         <w:numPr>
           <w:ilvl w:val="0"/>
-          <w:numId w:val="1"/>
+          <w:numId w:val="3"/>
         </w:numPr>
-      </w:pPr>
-      <w:r>
-        <w:t xml:space="preserve">[ ] Replay the convert instead of hoping</w:t>
-      </w:r>
-    </w:p>
-    <w:p>
-      <w:r>
+        <w:ind w:left="300" w:hanging="240"/>
+        <w:spacing w:after="240"/>
+      </w:pPr>
+      <w:r>
+        <w:rPr>
+          <w:rFonts w:ascii="Segoe UI" w:hAnsi="Segoe UI" w:cs="Segoe UI"/>
+          <w:color w:val="134E4A"/>
+        </w:rPr>
+        <w:t xml:space="preserve">Replay the convert instead of hoping</w:t>
+      </w:r>
+    </w:p>
+    <w:p>
+      <w:pPr>
+        <w:spacing w:after="168" w:line="276" w:lineRule="auto"/>
+      </w:pPr>
+      <w:r>
+        <w:rPr>
+          <w:rFonts w:ascii="Segoe UI" w:hAnsi="Segoe UI" w:cs="Segoe UI"/>
+          <w:color w:val="134E4A"/>
+        </w:rPr>
         <w:t xml:space="preserve">Agent replay:</w:t>
       </w:r>
     </w:p>
     <w:p>
       <w:pPr>
+        <w:pStyle w:val="ListParagraph"/>
         <w:numPr>
           <w:ilvl w:val="0"/>
           <w:numId w:val="2"/>
         </w:numPr>
-      </w:pPr>
-      <w:r>
+        <w:ind w:left="300" w:hanging="240"/>
+        <w:spacing w:after="84"/>
+      </w:pPr>
+      <w:r>
+        <w:rPr>
+          <w:rFonts w:ascii="Segoe UI" w:hAnsi="Segoe UI" w:cs="Segoe UI"/>
+          <w:color w:val="134E4A"/>
+        </w:rPr>
         <w:t xml:space="preserve">Hash the input</w:t>
       </w:r>
     </w:p>
     <w:p>
       <w:pPr>
+        <w:pStyle w:val="ListParagraph"/>
         <w:numPr>
           <w:ilvl w:val="0"/>
           <w:numId w:val="2"/>
         </w:numPr>
-      </w:pPr>
-      <w:r>
+        <w:ind w:left="300" w:hanging="240"/>
+        <w:spacing w:after="60"/>
+      </w:pPr>
+      <w:r>
+        <w:rPr>
+          <w:rFonts w:ascii="Segoe UI" w:hAnsi="Segoe UI" w:cs="Segoe UI"/>
+          <w:color w:val="134E4A"/>
+        </w:rPr>
         <w:t xml:space="preserve">Run Convert</w:t>
       </w:r>
     </w:p>
     <w:p>
       <w:pPr>
+        <w:pStyle w:val="ListParagraph"/>
         <w:numPr>
           <w:ilvl w:val="1"/>
           <w:numId w:val="1"/>
         </w:numPr>
-      </w:pPr>
-      <w:r>
+        <w:ind w:left="600" w:hanging="240"/>
+        <w:spacing w:after="84"/>
+      </w:pPr>
+      <w:r>
+        <w:rPr>
+          <w:rFonts w:ascii="Segoe UI" w:hAnsi="Segoe UI" w:cs="Segoe UI"/>
+          <w:color w:val="134E4A"/>
+        </w:rPr>
         <w:t xml:space="preserve">PDF/</w:t>
       </w:r>
       <w:r>
         <w:rPr>
+          <w:rStyle w:val="Superscript"/>
+          <w:rFonts w:ascii="Segoe UI" w:hAnsi="Segoe UI" w:cs="Segoe UI"/>
           <w:vertAlign w:val="superscript"/>
+          <w:color w:val="134E4A"/>
         </w:rPr>
         <w:t xml:space="preserve">A</w:t>
       </w:r>
     </w:p>
     <w:p>
       <w:pPr>
+        <w:pStyle w:val="ListParagraph"/>
         <w:numPr>
           <w:ilvl w:val="1"/>
           <w:numId w:val="1"/>
         </w:numPr>
-      </w:pPr>
-      <w:r>
+        <w:ind w:left="600" w:hanging="240"/>
+        <w:spacing w:after="84"/>
+      </w:pPr>
+      <w:r>
+        <w:rPr>
+          <w:rFonts w:ascii="Segoe UI" w:hAnsi="Segoe UI" w:cs="Segoe UI"/>
+          <w:color w:val="134E4A"/>
+        </w:rPr>
         <w:t xml:space="preserve">HTML</w:t>
       </w:r>
     </w:p>
     <w:p>
       <w:pPr>
+        <w:pStyle w:val="ListParagraph"/>
         <w:numPr>
           <w:ilvl w:val="0"/>
           <w:numId w:val="2"/>
         </w:numPr>
-      </w:pPr>
-      <w:r>
+        <w:ind w:left="300" w:hanging="240"/>
+        <w:spacing w:after="240"/>
+      </w:pPr>
+      <w:r>
+        <w:rPr>
+          <w:rFonts w:ascii="Segoe UI" w:hAnsi="Segoe UI" w:cs="Segoe UI"/>
+          <w:color w:val="134E4A"/>
+        </w:rPr>
         <w:t xml:space="preserve">Compare the capsule</w:t>
       </w:r>
     </w:p>
     <w:p>
+      <w:pPr>
+        <w:spacing w:after="168" w:line="276" w:lineRule="auto"/>
+      </w:pPr>
       <w:hyperlink r:id="rId4">
         <w:r>
           <w:rPr>
+            <w:rStyle w:val="Hyperlink"/>
+            <w:rFonts w:ascii="Segoe UI" w:hAnsi="Segoe UI" w:cs="Segoe UI"/>
             <w:u w:val="single"/>
             <w:color w:val="0D9488"/>
           </w:rPr>
@@ -482,30 +874,48 @@
         </w:r>
       </w:hyperlink>
       <w:r>
+        <w:rPr>
+          <w:rFonts w:ascii="Segoe UI" w:hAnsi="Segoe UI" w:cs="Segoe UI"/>
+          <w:color w:val="134E4A"/>
+        </w:rPr>
         <w:t xml:space="preserve"> runtime — DOCX · ODT · Markdown · HTML · PDF/</w:t>
       </w:r>
       <w:r>
         <w:rPr>
+          <w:rStyle w:val="Superscript"/>
+          <w:rFonts w:ascii="Segoe UI" w:hAnsi="Segoe UI" w:cs="Segoe UI"/>
           <w:vertAlign w:val="superscript"/>
+          <w:color w:val="134E4A"/>
         </w:rPr>
         <w:t xml:space="preserve">A</w:t>
       </w:r>
       <w:r>
+        <w:rPr>
+          <w:rFonts w:ascii="Segoe UI" w:hAnsi="Segoe UI" w:cs="Segoe UI"/>
+          <w:color w:val="134E4A"/>
+        </w:rPr>
         <w:t xml:space="preserve">. Seals: H</w:t>
       </w:r>
       <w:r>
         <w:rPr>
+          <w:rStyle w:val="Subscript"/>
+          <w:rFonts w:ascii="Segoe UI" w:hAnsi="Segoe UI" w:cs="Segoe UI"/>
           <w:vertAlign w:val="subscript"/>
+          <w:color w:val="134E4A"/>
         </w:rPr>
         <w:t xml:space="preserve">2</w:t>
       </w:r>
       <w:r>
+        <w:rPr>
+          <w:rFonts w:ascii="Segoe UI" w:hAnsi="Segoe UI" w:cs="Segoe UI"/>
+          <w:color w:val="134E4A"/>
+        </w:rPr>
         <w:t xml:space="preserve">O.</w:t>
       </w:r>
     </w:p>
     <w:sectPr>
       <w:pgSz w:w="11905" w:h="16837" w:orient="portrait"/>
-      <w:pgMar w:top="1700" w:right="1700" w:bottom="1700" w:left="1700" w:header="850" w:footer="850" w:gutter="0"/>
+      <w:pgMar w:top="600" w:right="660" w:bottom="600" w:left="660" w:header="300" w:footer="300" w:gutter="0"/>
     </w:sectPr>
   </w:body>
 </w:document>
@@ -521,7 +931,7 @@
       <w:lvlText w:val="•"/>
       <w:lvlJc w:val="left"/>
       <w:pPr>
-        <w:ind w:left="720" w:hanging="360"/>
+        <w:ind w:left="300" w:hanging="240"/>
       </w:pPr>
     </w:lvl>
     <w:lvl w:ilvl="1">
@@ -530,7 +940,7 @@
       <w:lvlText w:val="•"/>
       <w:lvlJc w:val="left"/>
       <w:pPr>
-        <w:ind w:left="1440" w:hanging="360"/>
+        <w:ind w:left="600" w:hanging="240"/>
       </w:pPr>
     </w:lvl>
     <w:lvl w:ilvl="2">
@@ -539,7 +949,7 @@
       <w:lvlText w:val="•"/>
       <w:lvlJc w:val="left"/>
       <w:pPr>
-        <w:ind w:left="2160" w:hanging="360"/>
+        <w:ind w:left="900" w:hanging="240"/>
       </w:pPr>
     </w:lvl>
   </w:abstractNum>
@@ -551,7 +961,7 @@
       <w:lvlText w:val="%1."/>
       <w:lvlJc w:val="left"/>
       <w:pPr>
-        <w:ind w:left="720" w:hanging="360"/>
+        <w:ind w:left="300" w:hanging="240"/>
       </w:pPr>
     </w:lvl>
     <w:lvl w:ilvl="1">
@@ -560,7 +970,7 @@
       <w:lvlText w:val="%2."/>
       <w:lvlJc w:val="left"/>
       <w:pPr>
-        <w:ind w:left="1440" w:hanging="360"/>
+        <w:ind w:left="600" w:hanging="240"/>
       </w:pPr>
     </w:lvl>
     <w:lvl w:ilvl="2">
@@ -569,8 +979,104 @@
       <w:lvlText w:val="%3."/>
       <w:lvlJc w:val="left"/>
       <w:pPr>
-        <w:ind w:left="2160" w:hanging="360"/>
-      </w:pPr>
+        <w:ind w:left="900" w:hanging="240"/>
+      </w:pPr>
+    </w:lvl>
+  </w:abstractNum>
+  <w:abstractNum w:abstractNumId="2">
+    <w:multiLevelType w:val="hybridMultilevel"/>
+    <w:lvl w:ilvl="0">
+      <w:start w:val="1"/>
+      <w:numFmt w:val="bullet"/>
+      <w:lvlText w:val="☐"/>
+      <w:lvlJc w:val="left"/>
+      <w:pPr>
+        <w:ind w:left="300" w:hanging="240"/>
+      </w:pPr>
+      <w:rPr>
+        <w:rFonts w:ascii="Segoe UI Symbol" w:hAnsi="Segoe UI Symbol" w:eastAsia="MS Gothic" w:cs="Segoe UI Symbol" w:hint="default"/>
+        <w:sz w:val="24"/>
+        <w:szCs w:val="24"/>
+        <w:color w:val="134E4A"/>
+      </w:rPr>
+    </w:lvl>
+    <w:lvl w:ilvl="1">
+      <w:start w:val="1"/>
+      <w:numFmt w:val="bullet"/>
+      <w:lvlText w:val="☐"/>
+      <w:lvlJc w:val="left"/>
+      <w:pPr>
+        <w:ind w:left="600" w:hanging="240"/>
+      </w:pPr>
+      <w:rPr>
+        <w:rFonts w:ascii="Segoe UI Symbol" w:hAnsi="Segoe UI Symbol" w:eastAsia="MS Gothic" w:cs="Segoe UI Symbol" w:hint="default"/>
+        <w:sz w:val="24"/>
+        <w:szCs w:val="24"/>
+        <w:color w:val="134E4A"/>
+      </w:rPr>
+    </w:lvl>
+    <w:lvl w:ilvl="2">
+      <w:start w:val="1"/>
+      <w:numFmt w:val="bullet"/>
+      <w:lvlText w:val="☐"/>
+      <w:lvlJc w:val="left"/>
+      <w:pPr>
+        <w:ind w:left="900" w:hanging="240"/>
+      </w:pPr>
+      <w:rPr>
+        <w:rFonts w:ascii="Segoe UI Symbol" w:hAnsi="Segoe UI Symbol" w:eastAsia="MS Gothic" w:cs="Segoe UI Symbol" w:hint="default"/>
+        <w:sz w:val="24"/>
+        <w:szCs w:val="24"/>
+        <w:color w:val="134E4A"/>
+      </w:rPr>
+    </w:lvl>
+  </w:abstractNum>
+  <w:abstractNum w:abstractNumId="3">
+    <w:multiLevelType w:val="hybridMultilevel"/>
+    <w:lvl w:ilvl="0">
+      <w:start w:val="1"/>
+      <w:numFmt w:val="bullet"/>
+      <w:lvlText w:val="☒"/>
+      <w:lvlJc w:val="left"/>
+      <w:pPr>
+        <w:ind w:left="300" w:hanging="240"/>
+      </w:pPr>
+      <w:rPr>
+        <w:rFonts w:ascii="Segoe UI Symbol" w:hAnsi="Segoe UI Symbol" w:eastAsia="MS Gothic" w:cs="Segoe UI Symbol" w:hint="default"/>
+        <w:sz w:val="24"/>
+        <w:szCs w:val="24"/>
+        <w:color w:val="134E4A"/>
+      </w:rPr>
+    </w:lvl>
+    <w:lvl w:ilvl="1">
+      <w:start w:val="1"/>
+      <w:numFmt w:val="bullet"/>
+      <w:lvlText w:val="☒"/>
+      <w:lvlJc w:val="left"/>
+      <w:pPr>
+        <w:ind w:left="600" w:hanging="240"/>
+      </w:pPr>
+      <w:rPr>
+        <w:rFonts w:ascii="Segoe UI Symbol" w:hAnsi="Segoe UI Symbol" w:eastAsia="MS Gothic" w:cs="Segoe UI Symbol" w:hint="default"/>
+        <w:sz w:val="24"/>
+        <w:szCs w:val="24"/>
+        <w:color w:val="134E4A"/>
+      </w:rPr>
+    </w:lvl>
+    <w:lvl w:ilvl="2">
+      <w:start w:val="1"/>
+      <w:numFmt w:val="bullet"/>
+      <w:lvlText w:val="☒"/>
+      <w:lvlJc w:val="left"/>
+      <w:pPr>
+        <w:ind w:left="900" w:hanging="240"/>
+      </w:pPr>
+      <w:rPr>
+        <w:rFonts w:ascii="Segoe UI Symbol" w:hAnsi="Segoe UI Symbol" w:eastAsia="MS Gothic" w:cs="Segoe UI Symbol" w:hint="default"/>
+        <w:sz w:val="24"/>
+        <w:szCs w:val="24"/>
+        <w:color w:val="134E4A"/>
+      </w:rPr>
     </w:lvl>
   </w:abstractNum>
   <w:num w:numId="1">
@@ -579,52 +1085,108 @@
   <w:num w:numId="2">
     <w:abstractNumId w:val="1"/>
   </w:num>
+  <w:num w:numId="3">
+    <w:abstractNumId w:val="2"/>
+  </w:num>
+  <w:num w:numId="4">
+    <w:abstractNumId w:val="3"/>
+  </w:num>
 </w:numbering>
 </file>
 
 <file path=word/styles.xml><?xml version="1.0" encoding="utf-8"?>
 <w:styles xmlns:w="http://schemas.openxmlformats.org/wordprocessingml/2006/main">
+  <w:docDefaults>
+    <w:rPrDefault>
+      <w:rPr>
+        <w:rFonts w:ascii="Segoe UI" w:hAnsi="Segoe UI" w:cs="Segoe UI"/>
+        <w:color w:val="134E4A"/>
+        <w:sz w:val="22"/>
+        <w:szCs w:val="22"/>
+      </w:rPr>
+    </w:rPrDefault>
+    <w:pPrDefault>
+      <w:pPr>
+        <w:spacing w:after="168" w:line="276" w:lineRule="auto"/>
+      </w:pPr>
+    </w:pPrDefault>
+  </w:docDefaults>
   <w:style w:type="paragraph" w:default="1" w:styleId="Normal">
     <w:name w:val="Normal"/>
+    <w:qFormat/>
+    <w:pPr>
+      <w:spacing w:after="168" w:line="276" w:lineRule="auto"/>
+    </w:pPr>
+    <w:rPr>
+      <w:rFonts w:ascii="Segoe UI" w:hAnsi="Segoe UI" w:cs="Segoe UI"/>
+      <w:color w:val="134E4A"/>
+      <w:sz w:val="22"/>
+      <w:szCs w:val="22"/>
+    </w:rPr>
   </w:style>
   <w:style w:type="paragraph" w:styleId="Heading1">
     <w:name w:val="heading 1"/>
     <w:basedOn w:val="Normal"/>
+    <w:next w:val="Normal"/>
     <w:uiPriority w:val="9"/>
     <w:qFormat/>
     <w:pPr>
+      <w:keepNext/>
+      <w:keepLines/>
+      <w:pBdr>
+        <w:bottom w:val="single" w:sz="18" w:space="5" w:color="134E4A"/>
+      </w:pBdr>
+      <w:spacing w:before="240" w:after="160" w:line="288" w:lineRule="auto"/>
       <w:outlineLvl w:val="0"/>
     </w:pPr>
     <w:rPr>
+      <w:rFonts w:ascii="Segoe UI" w:hAnsi="Segoe UI" w:cs="Segoe UI"/>
       <w:b/>
-      <w:sz w:val="36"/>
-      <w:szCs w:val="36"/>
+      <w:color w:val="134E4A"/>
+      <w:spacing w:val="-6"/>
+      <w:sz w:val="32"/>
+      <w:szCs w:val="32"/>
     </w:rPr>
   </w:style>
   <w:style w:type="paragraph" w:styleId="Heading2">
     <w:name w:val="heading 2"/>
     <w:basedOn w:val="Normal"/>
+    <w:next w:val="Normal"/>
     <w:uiPriority w:val="9"/>
     <w:qFormat/>
     <w:pPr>
+      <w:keepNext/>
+      <w:keepLines/>
+      <w:pBdr>
+        <w:bottom w:val="single" w:sz="12" w:space="2" w:color="0D9488"/>
+      </w:pBdr>
+      <w:spacing w:before="200" w:after="80" w:line="288" w:lineRule="auto"/>
       <w:outlineLvl w:val="1"/>
     </w:pPr>
     <w:rPr>
+      <w:rFonts w:ascii="Segoe UI" w:hAnsi="Segoe UI" w:cs="Segoe UI"/>
       <w:b/>
-      <w:sz w:val="28"/>
-      <w:szCs w:val="28"/>
+      <w:color w:val="134E4A"/>
+      <w:sz w:val="26"/>
+      <w:szCs w:val="26"/>
     </w:rPr>
   </w:style>
   <w:style w:type="paragraph" w:styleId="Heading3">
     <w:name w:val="heading 3"/>
     <w:basedOn w:val="Normal"/>
+    <w:next w:val="Normal"/>
     <w:uiPriority w:val="9"/>
     <w:qFormat/>
     <w:pPr>
+      <w:keepNext/>
+      <w:keepLines/>
+      <w:spacing w:before="80" w:after="80" w:line="288" w:lineRule="auto"/>
       <w:outlineLvl w:val="2"/>
     </w:pPr>
     <w:rPr>
+      <w:rFonts w:ascii="Segoe UI" w:hAnsi="Segoe UI" w:cs="Segoe UI"/>
       <w:b/>
+      <w:color w:val="134E4A"/>
       <w:sz w:val="24"/>
       <w:szCs w:val="24"/>
     </w:rPr>
@@ -637,14 +1199,78 @@
       <w:pBdr>
         <w:left w:val="single" w:sz="24" w:space="4" w:color="134E4A"/>
       </w:pBdr>
-      <w:ind w:left="144"/>
+      <w:spacing w:before="120" w:after="240"/>
+      <w:ind w:left="720"/>
     </w:pPr>
+    <w:rPr>
+      <w:rFonts w:ascii="Segoe UI" w:hAnsi="Segoe UI" w:cs="Segoe UI"/>
+      <w:color w:val="134E4A"/>
+    </w:rPr>
+  </w:style>
+  <w:style w:type="paragraph" w:styleId="ListParagraph">
+    <w:name w:val="List Paragraph"/>
+    <w:basedOn w:val="Normal"/>
+    <w:uiPriority w:val="34"/>
+    <w:qFormat/>
+    <w:pPr>
+      <w:ind w:left="300"/>
+      <w:spacing w:after="84"/>
+    </w:pPr>
+    <w:rPr>
+      <w:rFonts w:ascii="Segoe UI" w:hAnsi="Segoe UI" w:cs="Segoe UI"/>
+    </w:rPr>
   </w:style>
   <w:style w:type="character" w:styleId="Code">
     <w:name w:val="Code"/>
     <w:rPr>
       <w:rFonts w:ascii="Consolas" w:hAnsi="Consolas"/>
+      <w:color w:val="134E4A"/>
+      <w:sz w:val="20"/>
+      <w:szCs w:val="20"/>
+      <w:bdr w:val="single" w:sz="4" w:space="4" w:color="CCFBF1"/>
       <w:shd w:val="clear" w:fill="CCFBF1"/>
+    </w:rPr>
+  </w:style>
+  <w:style w:type="character" w:styleId="Mark">
+    <w:name w:val="Mark"/>
+    <w:rPr>
+      <w:rFonts w:ascii="Segoe UI" w:hAnsi="Segoe UI" w:cs="Segoe UI"/>
+      <w:color w:val="134E4A"/>
+      <w:highlight w:val="yellow"/>
+      <w:bdr w:val="single" w:sz="4" w:space="2" w:color="FDE68A"/>
+      <w:shd w:val="clear" w:fill="FDE68A"/>
+    </w:rPr>
+  </w:style>
+  <w:style w:type="character" w:styleId="Strike">
+    <w:name w:val="Strikethrough"/>
+    <w:rPr>
+      <w:strike/>
+    </w:rPr>
+  </w:style>
+  <w:style w:type="character" w:styleId="Underline">
+    <w:name w:val="Underline"/>
+    <w:rPr>
+      <w:u w:val="single"/>
+    </w:rPr>
+  </w:style>
+  <w:style w:type="character" w:styleId="Superscript">
+    <w:name w:val="Superscript"/>
+    <w:rPr>
+      <w:vertAlign w:val="superscript"/>
+    </w:rPr>
+  </w:style>
+  <w:style w:type="character" w:styleId="Subscript">
+    <w:name w:val="Subscript"/>
+    <w:rPr>
+      <w:vertAlign w:val="subscript"/>
+    </w:rPr>
+  </w:style>
+  <w:style w:type="character" w:styleId="Hyperlink">
+    <w:name w:val="Hyperlink"/>
+    <w:rPr>
+      <w:rFonts w:ascii="Segoe UI" w:hAnsi="Segoe UI" w:cs="Segoe UI"/>
+      <w:color w:val="0D9488"/>
+      <w:u w:val="single"/>
     </w:rPr>
   </w:style>
   <w:style w:type="paragraph" w:styleId="HorizontalLine">
@@ -652,19 +1278,62 @@
     <w:basedOn w:val="Normal"/>
     <w:pPr>
       <w:pBdr>
-        <w:bottom w:val="single" w:sz="12" w:space="1" w:color="134E4A"/>
+        <w:bottom w:val="single" w:sz="18" w:space="1" w:color="134E4A"/>
       </w:pBdr>
+      <w:spacing w:before="264" w:after="264"/>
     </w:pPr>
   </w:style>
   <w:style w:type="paragraph" w:styleId="CodeBlock">
     <w:name w:val="Code Block"/>
     <w:basedOn w:val="Normal"/>
     <w:pPr>
+      <w:pBdr>
+        <w:top w:val="single" w:sz="72" w:space="0" w:color="CCFBF1"/>
+        <w:bottom w:val="single" w:sz="72" w:space="0" w:color="CCFBF1"/>
+      </w:pBdr>
+      <w:spacing w:before="144" w:after="240"/>
+      <w:ind w:left="240" w:right="240"/>
       <w:shd w:val="clear" w:fill="CCFBF1"/>
     </w:pPr>
     <w:rPr>
       <w:rFonts w:ascii="Consolas" w:hAnsi="Consolas"/>
     </w:rPr>
   </w:style>
+  <w:style w:type="table" w:styleId="TableGrid">
+    <w:name w:val="Table Grid"/>
+    <w:tblPr>
+      <w:tblCellSpacing w:w="0" w:type="dxa"/>
+      <w:tblBorders>
+        <w:top w:val="single" w:sz="6" w:space="0" w:color="CBD5E1"/>
+        <w:left w:val="single" w:sz="6" w:space="0" w:color="CBD5E1"/>
+        <w:bottom w:val="single" w:sz="6" w:space="0" w:color="CBD5E1"/>
+        <w:right w:val="single" w:sz="6" w:space="0" w:color="CBD5E1"/>
+        <w:insideH w:val="single" w:sz="6" w:space="0" w:color="CBD5E1"/>
+        <w:insideV w:val="single" w:sz="6" w:space="0" w:color="CBD5E1"/>
+      </w:tblBorders>
+    </w:tblPr>
+    <w:tcPr>
+      <w:vAlign w:val="top"/>
+    </w:tcPr>
+    <w:rPr>
+      <w:sz w:val="23"/>
+      <w:szCs w:val="23"/>
+    </w:rPr>
+    <w:tblStylePr w:type="firstRow">
+      <w:tcPr>
+        <w:tcBorders>
+          <w:bottom w:val="single" w:sz="12" w:space="0" w:color="0D9488"/>
+        </w:tcBorders>
+        <w:shd w:val="clear" w:fill="CCFBF1"/>
+        <w:vAlign w:val="top"/>
+      </w:tcPr>
+      <w:rPr>
+        <w:b/>
+        <w:color w:val="134E4A"/>
+        <w:sz w:val="23"/>
+        <w:szCs w:val="23"/>
+      </w:rPr>
+    </w:tblStylePr>
+  </w:style>
 </w:styles>
 </file>
</xml_diff>